<commit_message>
docs: match online logbooks to dated table layout
</commit_message>
<xml_diff>
--- a/05-agile-logbook/Agile Logbook Submission (14 - 17 July).docx
+++ b/05-agile-logbook/Agile Logbook Submission (14 - 17 July).docx
@@ -74,169 +74,299 @@
         <w:t>Taskboard</w:t>
       </w:r>
     </w:p>
+    <w:tbl>
+      <w:tblPr>
+        <w:tblStyle w:val="TableGrid"/>
+        <w:tblW w:type="auto" w:w="0"/>
+        <w:jc w:val="center"/>
+        <w:tblLayout w:type="autofit"/>
+        <w:tblLook w:firstColumn="1" w:firstRow="1" w:lastColumn="0" w:lastRow="0" w:noHBand="0" w:noVBand="1" w:val="04A0"/>
+      </w:tblPr>
+      <w:tblGrid>
+        <w:gridCol w:w="3551"/>
+        <w:gridCol w:w="3551"/>
+        <w:gridCol w:w="3551"/>
+      </w:tblGrid>
+      <w:tr>
+        <w:tc>
+          <w:tcPr>
+            <w:tcW w:type="dxa" w:w="3551"/>
+            <w:vAlign w:val="center"/>
+            <w:shd w:fill="F2DDD5"/>
+          </w:tcPr>
+          <w:p>
+            <w:pPr>
+              <w:spacing w:after="0"/>
+            </w:pPr>
+            <w:r/>
+            <w:r>
+              <w:rPr>
+                <w:b/>
+              </w:rPr>
+              <w:t>Product Backlog</w:t>
+            </w:r>
+          </w:p>
+        </w:tc>
+        <w:tc>
+          <w:tcPr>
+            <w:tcW w:type="dxa" w:w="3551"/>
+            <w:vAlign w:val="center"/>
+            <w:shd w:fill="F2DDD5"/>
+          </w:tcPr>
+          <w:p>
+            <w:pPr>
+              <w:spacing w:after="0"/>
+            </w:pPr>
+            <w:r/>
+            <w:r>
+              <w:rPr>
+                <w:b/>
+              </w:rPr>
+              <w:t>In Progress</w:t>
+            </w:r>
+          </w:p>
+        </w:tc>
+        <w:tc>
+          <w:tcPr>
+            <w:tcW w:type="dxa" w:w="3551"/>
+            <w:vAlign w:val="center"/>
+            <w:shd w:fill="F2DDD5"/>
+          </w:tcPr>
+          <w:p>
+            <w:pPr>
+              <w:spacing w:after="0"/>
+            </w:pPr>
+            <w:r/>
+            <w:r>
+              <w:rPr>
+                <w:b/>
+              </w:rPr>
+              <w:t>Completed</w:t>
+            </w:r>
+          </w:p>
+        </w:tc>
+      </w:tr>
+      <w:tr>
+        <w:tc>
+          <w:tcPr>
+            <w:tcW w:type="dxa" w:w="3551"/>
+            <w:vAlign w:val="center"/>
+          </w:tcPr>
+          <w:p>
+            <w:pPr>
+              <w:spacing w:after="0"/>
+            </w:pPr>
+            <w:r/>
+            <w:r>
+              <w:rPr>
+                <w:b/>
+              </w:rPr>
+              <w:t>User Story 1</w:t>
+            </w:r>
+            <w:r>
+              <w:br/>
+              <w:t>As a student, I want affordable grocery bundles.</w:t>
+            </w:r>
+          </w:p>
+        </w:tc>
+        <w:tc>
+          <w:tcPr>
+            <w:tcW w:type="dxa" w:w="3551"/>
+            <w:vAlign w:val="center"/>
+          </w:tcPr>
+          <w:p>
+            <w:pPr>
+              <w:spacing w:after="0"/>
+            </w:pPr>
+            <w:r/>
+            <w:r>
+              <w:t>Validate grocery and supplier prices.</w:t>
+            </w:r>
+          </w:p>
+        </w:tc>
+        <w:tc>
+          <w:tcPr>
+            <w:tcW w:type="dxa" w:w="3551"/>
+            <w:vAlign w:val="center"/>
+          </w:tcPr>
+          <w:p>
+            <w:pPr>
+              <w:spacing w:after="0"/>
+            </w:pPr>
+            <w:r/>
+            <w:r>
+              <w:t>Defined student discounts and the Bulk Wallet.</w:t>
+            </w:r>
+          </w:p>
+        </w:tc>
+      </w:tr>
+      <w:tr>
+        <w:tc>
+          <w:tcPr>
+            <w:tcW w:type="dxa" w:w="3551"/>
+            <w:vAlign w:val="center"/>
+          </w:tcPr>
+          <w:p>
+            <w:pPr>
+              <w:spacing w:after="0"/>
+            </w:pPr>
+            <w:r/>
+            <w:r>
+              <w:rPr>
+                <w:b/>
+              </w:rPr>
+              <w:t>User Story 2</w:t>
+            </w:r>
+            <w:r>
+              <w:br/>
+              <w:t>As a student, I want to place and pay for an order easily.</w:t>
+            </w:r>
+          </w:p>
+        </w:tc>
+        <w:tc>
+          <w:tcPr>
+            <w:tcW w:type="dxa" w:w="3551"/>
+            <w:vAlign w:val="center"/>
+          </w:tcPr>
+          <w:p>
+            <w:pPr>
+              <w:spacing w:after="0"/>
+            </w:pPr>
+            <w:r/>
+            <w:r>
+              <w:t>Refine the ordering and payment steps.</w:t>
+            </w:r>
+          </w:p>
+        </w:tc>
+        <w:tc>
+          <w:tcPr>
+            <w:tcW w:type="dxa" w:w="3551"/>
+            <w:vAlign w:val="center"/>
+          </w:tcPr>
+          <w:p>
+            <w:pPr>
+              <w:spacing w:after="0"/>
+            </w:pPr>
+            <w:r/>
+            <w:r>
+              <w:t>Mapped the Place and Pay process.</w:t>
+            </w:r>
+          </w:p>
+        </w:tc>
+      </w:tr>
+      <w:tr>
+        <w:tc>
+          <w:tcPr>
+            <w:tcW w:type="dxa" w:w="3551"/>
+            <w:vAlign w:val="center"/>
+          </w:tcPr>
+          <w:p>
+            <w:pPr>
+              <w:spacing w:after="0"/>
+            </w:pPr>
+            <w:r/>
+            <w:r>
+              <w:rPr>
+                <w:b/>
+              </w:rPr>
+              <w:t>User Story 3</w:t>
+            </w:r>
+            <w:r>
+              <w:br/>
+              <w:t>As a student, I want same-day residence delivery.</w:t>
+            </w:r>
+          </w:p>
+        </w:tc>
+        <w:tc>
+          <w:tcPr>
+            <w:tcW w:type="dxa" w:w="3551"/>
+            <w:vAlign w:val="center"/>
+          </w:tcPr>
+          <w:p>
+            <w:pPr>
+              <w:spacing w:after="0"/>
+            </w:pPr>
+            <w:r/>
+            <w:r>
+              <w:t>Confirm delivery costs and partners.</w:t>
+            </w:r>
+          </w:p>
+        </w:tc>
+        <w:tc>
+          <w:tcPr>
+            <w:tcW w:type="dxa" w:w="3551"/>
+            <w:vAlign w:val="center"/>
+          </w:tcPr>
+          <w:p>
+            <w:pPr>
+              <w:spacing w:after="0"/>
+            </w:pPr>
+            <w:r/>
+            <w:r>
+              <w:t>Proposed a R45 fee and same-day delivery window.</w:t>
+            </w:r>
+          </w:p>
+        </w:tc>
+      </w:tr>
+      <w:tr>
+        <w:tc>
+          <w:tcPr>
+            <w:tcW w:type="dxa" w:w="3551"/>
+            <w:vAlign w:val="center"/>
+          </w:tcPr>
+          <w:p>
+            <w:pPr>
+              <w:spacing w:after="0"/>
+            </w:pPr>
+            <w:r/>
+            <w:r>
+              <w:rPr>
+                <w:b/>
+              </w:rPr>
+              <w:t>User Story 4</w:t>
+            </w:r>
+            <w:r>
+              <w:br/>
+              <w:t>As a student, I want safe and traceable collection.</w:t>
+            </w:r>
+          </w:p>
+        </w:tc>
+        <w:tc>
+          <w:tcPr>
+            <w:tcW w:type="dxa" w:w="3551"/>
+            <w:vAlign w:val="center"/>
+          </w:tcPr>
+          <w:p>
+            <w:pPr>
+              <w:spacing w:after="0"/>
+            </w:pPr>
+            <w:r/>
+            <w:r>
+              <w:t>Clarify the Block Agent responsibilities.</w:t>
+            </w:r>
+          </w:p>
+        </w:tc>
+        <w:tc>
+          <w:tcPr>
+            <w:tcW w:type="dxa" w:w="3551"/>
+            <w:vAlign w:val="center"/>
+          </w:tcPr>
+          <w:p>
+            <w:pPr>
+              <w:spacing w:after="0"/>
+            </w:pPr>
+            <w:r/>
+            <w:r>
+              <w:t>Defined verified orders and safe handovers.</w:t>
+            </w:r>
+          </w:p>
+        </w:tc>
+      </w:tr>
+    </w:tbl>
     <w:p>
       <w:pPr>
-        <w:pStyle w:val="Heading2"/>
+        <w:spacing w:after="0"/>
       </w:pPr>
-      <w:r>
-        <w:t>User Story 1</w:t>
-      </w:r>
-    </w:p>
-    <w:p>
-      <w:r>
-        <w:rPr>
-          <w:b/>
-        </w:rPr>
-        <w:t>Product Backlog:</w:t>
-      </w:r>
-      <w:r>
-        <w:t xml:space="preserve"> As a student, I want affordable grocery bundles.</w:t>
-      </w:r>
-    </w:p>
-    <w:p>
-      <w:r>
-        <w:rPr>
-          <w:b/>
-        </w:rPr>
-        <w:t>In Progress:</w:t>
-      </w:r>
-      <w:r>
-        <w:t xml:space="preserve"> Validate grocery and supplier prices.</w:t>
-      </w:r>
-    </w:p>
-    <w:p>
-      <w:r>
-        <w:rPr>
-          <w:b/>
-        </w:rPr>
-        <w:t>Completed:</w:t>
-      </w:r>
-      <w:r>
-        <w:t xml:space="preserve"> Defined student discounts and the Bulk Wallet.</w:t>
-      </w:r>
-    </w:p>
-    <w:p>
-      <w:pPr>
-        <w:pStyle w:val="Heading2"/>
-      </w:pPr>
-      <w:r>
-        <w:t>User Story 2</w:t>
-      </w:r>
-    </w:p>
-    <w:p>
-      <w:r>
-        <w:rPr>
-          <w:b/>
-        </w:rPr>
-        <w:t>Product Backlog:</w:t>
-      </w:r>
-      <w:r>
-        <w:t xml:space="preserve"> As a student, I want to place and pay for an order easily.</w:t>
-      </w:r>
-    </w:p>
-    <w:p>
-      <w:r>
-        <w:rPr>
-          <w:b/>
-        </w:rPr>
-        <w:t>In Progress:</w:t>
-      </w:r>
-      <w:r>
-        <w:t xml:space="preserve"> Refine the ordering and payment steps.</w:t>
-      </w:r>
-    </w:p>
-    <w:p>
-      <w:r>
-        <w:rPr>
-          <w:b/>
-        </w:rPr>
-        <w:t>Completed:</w:t>
-      </w:r>
-      <w:r>
-        <w:t xml:space="preserve"> Mapped the Place and Pay process.</w:t>
-      </w:r>
-    </w:p>
-    <w:p>
-      <w:pPr>
-        <w:pStyle w:val="Heading2"/>
-      </w:pPr>
-      <w:r>
-        <w:t>User Story 3</w:t>
-      </w:r>
-    </w:p>
-    <w:p>
-      <w:r>
-        <w:rPr>
-          <w:b/>
-        </w:rPr>
-        <w:t>Product Backlog:</w:t>
-      </w:r>
-      <w:r>
-        <w:t xml:space="preserve"> As a student, I want same-day residence delivery.</w:t>
-      </w:r>
-    </w:p>
-    <w:p>
-      <w:r>
-        <w:rPr>
-          <w:b/>
-        </w:rPr>
-        <w:t>In Progress:</w:t>
-      </w:r>
-      <w:r>
-        <w:t xml:space="preserve"> Confirm delivery costs and partners.</w:t>
-      </w:r>
-    </w:p>
-    <w:p>
-      <w:r>
-        <w:rPr>
-          <w:b/>
-        </w:rPr>
-        <w:t>Completed:</w:t>
-      </w:r>
-      <w:r>
-        <w:t xml:space="preserve"> Proposed a R45 fee and same-day delivery window.</w:t>
-      </w:r>
-    </w:p>
-    <w:p>
-      <w:pPr>
-        <w:pStyle w:val="Heading2"/>
-      </w:pPr>
-      <w:r>
-        <w:t>User Story 4</w:t>
-      </w:r>
-    </w:p>
-    <w:p>
-      <w:r>
-        <w:rPr>
-          <w:b/>
-        </w:rPr>
-        <w:t>Product Backlog:</w:t>
-      </w:r>
-      <w:r>
-        <w:t xml:space="preserve"> As a student, I want safe and traceable collection.</w:t>
-      </w:r>
-    </w:p>
-    <w:p>
-      <w:r>
-        <w:rPr>
-          <w:b/>
-        </w:rPr>
-        <w:t>In Progress:</w:t>
-      </w:r>
-      <w:r>
-        <w:t xml:space="preserve"> Clarify the Block Agent responsibilities.</w:t>
-      </w:r>
-    </w:p>
-    <w:p>
-      <w:r>
-        <w:rPr>
-          <w:b/>
-        </w:rPr>
-        <w:t>Completed:</w:t>
-      </w:r>
-      <w:r>
-        <w:t xml:space="preserve"> Defined verified orders and safe handovers.</w:t>
-      </w:r>
     </w:p>
     <w:p>
       <w:pPr>
@@ -246,323 +376,1802 @@
         <w:t>Walkthrough</w:t>
       </w:r>
     </w:p>
+    <w:tbl>
+      <w:tblPr>
+        <w:tblStyle w:val="TableGrid"/>
+        <w:tblW w:type="auto" w:w="0"/>
+        <w:jc w:val="center"/>
+        <w:tblLayout w:type="autofit"/>
+        <w:tblLook w:firstColumn="1" w:firstRow="1" w:lastColumn="0" w:lastRow="0" w:noHBand="0" w:noVBand="1" w:val="04A0"/>
+      </w:tblPr>
+      <w:tblGrid>
+        <w:gridCol w:w="3551"/>
+        <w:gridCol w:w="3551"/>
+        <w:gridCol w:w="3551"/>
+      </w:tblGrid>
+      <w:tr>
+        <w:tc>
+          <w:tcPr>
+            <w:tcW w:type="dxa" w:w="3551"/>
+            <w:vAlign w:val="center"/>
+            <w:shd w:fill="DCEED2"/>
+          </w:tcPr>
+          <w:p>
+            <w:pPr>
+              <w:spacing w:after="0"/>
+            </w:pPr>
+            <w:r/>
+            <w:r>
+              <w:rPr>
+                <w:b/>
+              </w:rPr>
+              <w:t>No.</w:t>
+            </w:r>
+          </w:p>
+        </w:tc>
+        <w:tc>
+          <w:tcPr>
+            <w:tcW w:type="dxa" w:w="3551"/>
+            <w:vAlign w:val="center"/>
+            <w:shd w:fill="DCEED2"/>
+          </w:tcPr>
+          <w:p>
+            <w:pPr>
+              <w:spacing w:after="0"/>
+            </w:pPr>
+            <w:r/>
+            <w:r>
+              <w:rPr>
+                <w:b/>
+              </w:rPr>
+              <w:t>Question</w:t>
+            </w:r>
+          </w:p>
+        </w:tc>
+        <w:tc>
+          <w:tcPr>
+            <w:tcW w:type="dxa" w:w="3551"/>
+            <w:vAlign w:val="center"/>
+            <w:shd w:fill="DCEED2"/>
+          </w:tcPr>
+          <w:p>
+            <w:pPr>
+              <w:spacing w:after="0"/>
+            </w:pPr>
+            <w:r/>
+            <w:r>
+              <w:rPr>
+                <w:b/>
+              </w:rPr>
+              <w:t>Response</w:t>
+            </w:r>
+          </w:p>
+        </w:tc>
+      </w:tr>
+      <w:tr>
+        <w:tc>
+          <w:tcPr>
+            <w:tcW w:type="dxa" w:w="3551"/>
+            <w:vAlign w:val="center"/>
+            <w:shd w:fill="DCEED2"/>
+          </w:tcPr>
+          <w:p>
+            <w:pPr>
+              <w:spacing w:after="0"/>
+            </w:pPr>
+            <w:r/>
+            <w:r>
+              <w:t>1</w:t>
+            </w:r>
+          </w:p>
+        </w:tc>
+        <w:tc>
+          <w:tcPr>
+            <w:tcW w:type="dxa" w:w="3551"/>
+            <w:vAlign w:val="center"/>
+            <w:shd w:fill="DCEED2"/>
+          </w:tcPr>
+          <w:p>
+            <w:pPr>
+              <w:spacing w:after="0"/>
+            </w:pPr>
+            <w:r/>
+            <w:r>
+              <w:t>What do we need to do to advance this piece of work?</w:t>
+            </w:r>
+          </w:p>
+        </w:tc>
+        <w:tc>
+          <w:tcPr>
+            <w:tcW w:type="dxa" w:w="3551"/>
+            <w:vAlign w:val="center"/>
+          </w:tcPr>
+          <w:p>
+            <w:pPr>
+              <w:spacing w:after="0"/>
+            </w:pPr>
+            <w:r/>
+            <w:r>
+              <w:t>Validate prices, delivery costs and student demand.</w:t>
+            </w:r>
+          </w:p>
+        </w:tc>
+      </w:tr>
+      <w:tr>
+        <w:tc>
+          <w:tcPr>
+            <w:tcW w:type="dxa" w:w="3551"/>
+            <w:vAlign w:val="center"/>
+            <w:shd w:fill="DCEED2"/>
+          </w:tcPr>
+          <w:p>
+            <w:pPr>
+              <w:spacing w:after="0"/>
+            </w:pPr>
+            <w:r/>
+            <w:r>
+              <w:t>2</w:t>
+            </w:r>
+          </w:p>
+        </w:tc>
+        <w:tc>
+          <w:tcPr>
+            <w:tcW w:type="dxa" w:w="3551"/>
+            <w:vAlign w:val="center"/>
+            <w:shd w:fill="DCEED2"/>
+          </w:tcPr>
+          <w:p>
+            <w:pPr>
+              <w:spacing w:after="0"/>
+            </w:pPr>
+            <w:r/>
+            <w:r>
+              <w:t>Is anyone working on anything that is not on the board?</w:t>
+            </w:r>
+          </w:p>
+        </w:tc>
+        <w:tc>
+          <w:tcPr>
+            <w:tcW w:type="dxa" w:w="3551"/>
+            <w:vAlign w:val="center"/>
+          </w:tcPr>
+          <w:p>
+            <w:pPr>
+              <w:spacing w:after="0"/>
+            </w:pPr>
+            <w:r/>
+            <w:r>
+              <w:t>No. All team activities were added to the board.</w:t>
+            </w:r>
+          </w:p>
+        </w:tc>
+      </w:tr>
+      <w:tr>
+        <w:tc>
+          <w:tcPr>
+            <w:tcW w:type="dxa" w:w="3551"/>
+            <w:vAlign w:val="center"/>
+            <w:shd w:fill="DCEED2"/>
+          </w:tcPr>
+          <w:p>
+            <w:pPr>
+              <w:spacing w:after="0"/>
+            </w:pPr>
+            <w:r/>
+            <w:r>
+              <w:t>3</w:t>
+            </w:r>
+          </w:p>
+        </w:tc>
+        <w:tc>
+          <w:tcPr>
+            <w:tcW w:type="dxa" w:w="3551"/>
+            <w:vAlign w:val="center"/>
+            <w:shd w:fill="DCEED2"/>
+          </w:tcPr>
+          <w:p>
+            <w:pPr>
+              <w:spacing w:after="0"/>
+            </w:pPr>
+            <w:r/>
+            <w:r>
+              <w:t>What do we need to finish as a team?</w:t>
+            </w:r>
+          </w:p>
+        </w:tc>
+        <w:tc>
+          <w:tcPr>
+            <w:tcW w:type="dxa" w:w="3551"/>
+            <w:vAlign w:val="center"/>
+          </w:tcPr>
+          <w:p>
+            <w:pPr>
+              <w:spacing w:after="0"/>
+            </w:pPr>
+            <w:r/>
+            <w:r>
+              <w:t>Finalise the slides and allocate presentation sections.</w:t>
+            </w:r>
+          </w:p>
+        </w:tc>
+      </w:tr>
+      <w:tr>
+        <w:tc>
+          <w:tcPr>
+            <w:tcW w:type="dxa" w:w="3551"/>
+            <w:vAlign w:val="center"/>
+            <w:shd w:fill="DCEED2"/>
+          </w:tcPr>
+          <w:p>
+            <w:pPr>
+              <w:spacing w:after="0"/>
+            </w:pPr>
+            <w:r/>
+            <w:r>
+              <w:t>4</w:t>
+            </w:r>
+          </w:p>
+        </w:tc>
+        <w:tc>
+          <w:tcPr>
+            <w:tcW w:type="dxa" w:w="3551"/>
+            <w:vAlign w:val="center"/>
+            <w:shd w:fill="DCEED2"/>
+          </w:tcPr>
+          <w:p>
+            <w:pPr>
+              <w:spacing w:after="0"/>
+            </w:pPr>
+            <w:r/>
+            <w:r>
+              <w:t>Are there any bottlenecks or blockers to the flow of work?</w:t>
+            </w:r>
+          </w:p>
+        </w:tc>
+        <w:tc>
+          <w:tcPr>
+            <w:tcW w:type="dxa" w:w="3551"/>
+            <w:vAlign w:val="center"/>
+          </w:tcPr>
+          <w:p>
+            <w:pPr>
+              <w:spacing w:after="0"/>
+            </w:pPr>
+            <w:r/>
+            <w:r>
+              <w:t>Limited time and unconfirmed supplier and delivery costs.</w:t>
+            </w:r>
+          </w:p>
+        </w:tc>
+      </w:tr>
+    </w:tbl>
     <w:p>
       <w:pPr>
-        <w:pStyle w:val="Heading2"/>
+        <w:spacing w:after="0"/>
       </w:pPr>
-      <w:r>
-        <w:t>What do we need to do to advance this piece of work?</w:t>
-      </w:r>
-    </w:p>
-    <w:p>
-      <w:r>
-        <w:t>Validate prices, delivery costs and student demand.</w:t>
-      </w:r>
-    </w:p>
-    <w:p>
-      <w:pPr>
-        <w:pStyle w:val="Heading2"/>
-      </w:pPr>
-      <w:r>
-        <w:t>Is anyone working on anything that is not on the board?</w:t>
-      </w:r>
-    </w:p>
-    <w:p>
-      <w:r>
-        <w:t>No. All team activities were added to the board.</w:t>
-      </w:r>
-    </w:p>
-    <w:p>
-      <w:pPr>
-        <w:pStyle w:val="Heading2"/>
-      </w:pPr>
-      <w:r>
-        <w:t>What do we need to finish as a team?</w:t>
-      </w:r>
-    </w:p>
-    <w:p>
-      <w:r>
-        <w:t>Finalise the slides and allocate presentation sections.</w:t>
-      </w:r>
-    </w:p>
-    <w:p>
-      <w:pPr>
-        <w:pStyle w:val="Heading2"/>
-      </w:pPr>
-      <w:r>
-        <w:t>Are there any bottlenecks or blockers to the flow of work?</w:t>
-      </w:r>
-    </w:p>
-    <w:p>
-      <w:r>
-        <w:t>Limited time and unconfirmed supplier and delivery costs.</w:t>
-      </w:r>
     </w:p>
     <w:p>
       <w:pPr>
         <w:pStyle w:val="Heading1"/>
       </w:pPr>
       <w:r>
-        <w:t>Daily Stand-up Log</w:t>
+        <w:t>Logbook</w:t>
       </w:r>
     </w:p>
     <w:p>
       <w:pPr>
         <w:pStyle w:val="Heading2"/>
+        <w:spacing w:before="200" w:after="80"/>
       </w:pPr>
       <w:r>
-        <w:t>Monday — 13 July 2026</w:t>
+        <w:t>Date: 13 July 2026 — Outside reporting period</w:t>
       </w:r>
     </w:p>
-    <w:p>
-      <w:r>
-        <w:rPr>
-          <w:i/>
-        </w:rPr>
-        <w:t>Outside the reporting period.</w:t>
-      </w:r>
-    </w:p>
+    <w:tbl>
+      <w:tblPr>
+        <w:tblStyle w:val="TableGrid"/>
+        <w:tblW w:type="auto" w:w="0"/>
+        <w:jc w:val="center"/>
+        <w:tblLayout w:type="autofit"/>
+        <w:tblLook w:firstColumn="1" w:firstRow="1" w:lastColumn="0" w:lastRow="0" w:noHBand="0" w:noVBand="1" w:val="04A0"/>
+      </w:tblPr>
+      <w:tblGrid>
+        <w:gridCol w:w="2663"/>
+        <w:gridCol w:w="2663"/>
+        <w:gridCol w:w="2663"/>
+        <w:gridCol w:w="2663"/>
+      </w:tblGrid>
+      <w:tr>
+        <w:tc>
+          <w:tcPr>
+            <w:tcW w:type="dxa" w:w="2663"/>
+            <w:vAlign w:val="center"/>
+            <w:shd w:fill="D9EDF7"/>
+          </w:tcPr>
+          <w:p>
+            <w:pPr>
+              <w:spacing w:after="0"/>
+            </w:pPr>
+            <w:r/>
+            <w:r>
+              <w:rPr>
+                <w:b/>
+              </w:rPr>
+              <w:t>Day</w:t>
+            </w:r>
+          </w:p>
+        </w:tc>
+        <w:tc>
+          <w:tcPr>
+            <w:tcW w:type="dxa" w:w="2663"/>
+            <w:vAlign w:val="center"/>
+            <w:shd w:fill="D9EDF7"/>
+          </w:tcPr>
+          <w:p>
+            <w:pPr>
+              <w:spacing w:after="0"/>
+            </w:pPr>
+            <w:r/>
+            <w:r>
+              <w:rPr>
+                <w:b/>
+              </w:rPr>
+              <w:t>No.</w:t>
+            </w:r>
+          </w:p>
+        </w:tc>
+        <w:tc>
+          <w:tcPr>
+            <w:tcW w:type="dxa" w:w="2663"/>
+            <w:vAlign w:val="center"/>
+            <w:shd w:fill="D9EDF7"/>
+          </w:tcPr>
+          <w:p>
+            <w:pPr>
+              <w:spacing w:after="0"/>
+            </w:pPr>
+            <w:r/>
+            <w:r>
+              <w:rPr>
+                <w:b/>
+              </w:rPr>
+              <w:t>Stand-up question</w:t>
+            </w:r>
+          </w:p>
+        </w:tc>
+        <w:tc>
+          <w:tcPr>
+            <w:tcW w:type="dxa" w:w="2663"/>
+            <w:vAlign w:val="center"/>
+            <w:shd w:fill="D9EDF7"/>
+          </w:tcPr>
+          <w:p>
+            <w:pPr>
+              <w:spacing w:after="0"/>
+            </w:pPr>
+            <w:r/>
+            <w:r>
+              <w:rPr>
+                <w:b/>
+              </w:rPr>
+              <w:t>Response</w:t>
+            </w:r>
+          </w:p>
+        </w:tc>
+      </w:tr>
+      <w:tr>
+        <w:tc>
+          <w:tcPr>
+            <w:tcW w:type="dxa" w:w="2663"/>
+            <w:vAlign w:val="center"/>
+            <w:vMerge w:val="restart"/>
+            <w:shd w:fill="D9EDF7"/>
+            <w:textDirection w:val="btLr"/>
+          </w:tcPr>
+          <w:p>
+            <w:pPr>
+              <w:spacing w:after="0"/>
+              <w:jc w:val="center"/>
+            </w:pPr>
+            <w:r/>
+            <w:r>
+              <w:t>Monday</w:t>
+            </w:r>
+          </w:p>
+          <w:p>
+            <w:pPr>
+              <w:spacing w:after="0"/>
+            </w:pPr>
+            <w:r/>
+          </w:p>
+          <w:p>
+            <w:pPr>
+              <w:spacing w:after="0"/>
+            </w:pPr>
+            <w:r/>
+          </w:p>
+        </w:tc>
+        <w:tc>
+          <w:tcPr>
+            <w:tcW w:type="dxa" w:w="2663"/>
+            <w:vAlign w:val="center"/>
+            <w:shd w:fill="EAF4F9"/>
+          </w:tcPr>
+          <w:p>
+            <w:pPr>
+              <w:spacing w:after="0"/>
+            </w:pPr>
+            <w:r/>
+            <w:r>
+              <w:t>1</w:t>
+            </w:r>
+          </w:p>
+        </w:tc>
+        <w:tc>
+          <w:tcPr>
+            <w:tcW w:type="dxa" w:w="2663"/>
+            <w:vAlign w:val="center"/>
+            <w:shd w:fill="EAF4F9"/>
+          </w:tcPr>
+          <w:p>
+            <w:pPr>
+              <w:spacing w:after="0"/>
+            </w:pPr>
+            <w:r/>
+            <w:r>
+              <w:t>What did I complete since the last stand-up?</w:t>
+            </w:r>
+          </w:p>
+        </w:tc>
+        <w:tc>
+          <w:tcPr>
+            <w:tcW w:type="dxa" w:w="2663"/>
+            <w:vAlign w:val="center"/>
+          </w:tcPr>
+          <w:p>
+            <w:pPr>
+              <w:spacing w:after="0"/>
+            </w:pPr>
+            <w:r/>
+            <w:r>
+              <w:t>Updated the user stories on Trello.</w:t>
+            </w:r>
+          </w:p>
+        </w:tc>
+      </w:tr>
+      <w:tr>
+        <w:tc>
+          <w:tcPr>
+            <w:tcW w:type="dxa" w:w="2663"/>
+            <w:vAlign w:val="center"/>
+            <w:vMerge/>
+            <w:shd w:fill="D9EDF7"/>
+          </w:tcPr>
+          <w:p/>
+        </w:tc>
+        <w:tc>
+          <w:tcPr>
+            <w:tcW w:type="dxa" w:w="2663"/>
+            <w:vAlign w:val="center"/>
+            <w:shd w:fill="EAF4F9"/>
+          </w:tcPr>
+          <w:p>
+            <w:pPr>
+              <w:spacing w:after="0"/>
+            </w:pPr>
+            <w:r/>
+            <w:r>
+              <w:t>2</w:t>
+            </w:r>
+          </w:p>
+        </w:tc>
+        <w:tc>
+          <w:tcPr>
+            <w:tcW w:type="dxa" w:w="2663"/>
+            <w:vAlign w:val="center"/>
+            <w:shd w:fill="EAF4F9"/>
+          </w:tcPr>
+          <w:p>
+            <w:pPr>
+              <w:spacing w:after="0"/>
+            </w:pPr>
+            <w:r/>
+            <w:r>
+              <w:t>What am I planning to complete between now and the next stand-up?</w:t>
+            </w:r>
+          </w:p>
+        </w:tc>
+        <w:tc>
+          <w:tcPr>
+            <w:tcW w:type="dxa" w:w="2663"/>
+            <w:vAlign w:val="center"/>
+          </w:tcPr>
+          <w:p>
+            <w:pPr>
+              <w:spacing w:after="0"/>
+            </w:pPr>
+            <w:r/>
+            <w:r>
+              <w:t>Add days to the sprint logs.</w:t>
+            </w:r>
+          </w:p>
+        </w:tc>
+      </w:tr>
+      <w:tr>
+        <w:tc>
+          <w:tcPr>
+            <w:tcW w:type="dxa" w:w="2663"/>
+            <w:vAlign w:val="center"/>
+            <w:vMerge/>
+            <w:shd w:fill="D9EDF7"/>
+          </w:tcPr>
+          <w:p/>
+        </w:tc>
+        <w:tc>
+          <w:tcPr>
+            <w:tcW w:type="dxa" w:w="2663"/>
+            <w:vAlign w:val="center"/>
+            <w:shd w:fill="EAF4F9"/>
+          </w:tcPr>
+          <w:p>
+            <w:pPr>
+              <w:spacing w:after="0"/>
+            </w:pPr>
+            <w:r/>
+            <w:r>
+              <w:t>3</w:t>
+            </w:r>
+          </w:p>
+        </w:tc>
+        <w:tc>
+          <w:tcPr>
+            <w:tcW w:type="dxa" w:w="2663"/>
+            <w:vAlign w:val="center"/>
+            <w:shd w:fill="EAF4F9"/>
+          </w:tcPr>
+          <w:p>
+            <w:pPr>
+              <w:spacing w:after="0"/>
+            </w:pPr>
+            <w:r/>
+            <w:r>
+              <w:t>What are my impediments, risks or problems?</w:t>
+            </w:r>
+          </w:p>
+        </w:tc>
+        <w:tc>
+          <w:tcPr>
+            <w:tcW w:type="dxa" w:w="2663"/>
+            <w:vAlign w:val="center"/>
+          </w:tcPr>
+          <w:p>
+            <w:pPr>
+              <w:spacing w:after="0"/>
+            </w:pPr>
+            <w:r/>
+            <w:r>
+              <w:t>Not applicable.</w:t>
+            </w:r>
+          </w:p>
+        </w:tc>
+      </w:tr>
+    </w:tbl>
     <w:p>
       <w:pPr>
-        <w:pStyle w:val="ListBullet"/>
+        <w:spacing w:after="0"/>
       </w:pPr>
-      <w:r>
-        <w:rPr>
-          <w:b/>
-        </w:rPr>
-        <w:t>Completed since the last stand-up:</w:t>
-      </w:r>
-      <w:r>
-        <w:t xml:space="preserve"> Updated the user stories on Trello.</w:t>
-      </w:r>
-    </w:p>
-    <w:p>
-      <w:pPr>
-        <w:pStyle w:val="ListBullet"/>
-      </w:pPr>
-      <w:r>
-        <w:rPr>
-          <w:b/>
-        </w:rPr>
-        <w:t>Planned before the next stand-up:</w:t>
-      </w:r>
-      <w:r>
-        <w:t xml:space="preserve"> Add days to the sprint logs.</w:t>
-      </w:r>
-    </w:p>
-    <w:p>
-      <w:pPr>
-        <w:pStyle w:val="ListBullet"/>
-      </w:pPr>
-      <w:r>
-        <w:rPr>
-          <w:b/>
-        </w:rPr>
-        <w:t>Impediments, risks or problems:</w:t>
-      </w:r>
-      <w:r>
-        <w:t xml:space="preserve"> Not applicable.</w:t>
-      </w:r>
     </w:p>
     <w:p>
       <w:pPr>
         <w:pStyle w:val="Heading2"/>
+        <w:spacing w:before="200" w:after="80"/>
       </w:pPr>
       <w:r>
-        <w:t>Tuesday — 14 July 2026</w:t>
+        <w:t>Date: 14 July 2026</w:t>
       </w:r>
     </w:p>
+    <w:tbl>
+      <w:tblPr>
+        <w:tblStyle w:val="TableGrid"/>
+        <w:tblW w:type="auto" w:w="0"/>
+        <w:jc w:val="center"/>
+        <w:tblLayout w:type="autofit"/>
+        <w:tblLook w:firstColumn="1" w:firstRow="1" w:lastColumn="0" w:lastRow="0" w:noHBand="0" w:noVBand="1" w:val="04A0"/>
+      </w:tblPr>
+      <w:tblGrid>
+        <w:gridCol w:w="2663"/>
+        <w:gridCol w:w="2663"/>
+        <w:gridCol w:w="2663"/>
+        <w:gridCol w:w="2663"/>
+      </w:tblGrid>
+      <w:tr>
+        <w:tc>
+          <w:tcPr>
+            <w:tcW w:type="dxa" w:w="2663"/>
+            <w:vAlign w:val="center"/>
+            <w:shd w:fill="D9EDF7"/>
+          </w:tcPr>
+          <w:p>
+            <w:pPr>
+              <w:spacing w:after="0"/>
+            </w:pPr>
+            <w:r/>
+            <w:r>
+              <w:rPr>
+                <w:b/>
+              </w:rPr>
+              <w:t>Day</w:t>
+            </w:r>
+          </w:p>
+        </w:tc>
+        <w:tc>
+          <w:tcPr>
+            <w:tcW w:type="dxa" w:w="2663"/>
+            <w:vAlign w:val="center"/>
+            <w:shd w:fill="D9EDF7"/>
+          </w:tcPr>
+          <w:p>
+            <w:pPr>
+              <w:spacing w:after="0"/>
+            </w:pPr>
+            <w:r/>
+            <w:r>
+              <w:rPr>
+                <w:b/>
+              </w:rPr>
+              <w:t>No.</w:t>
+            </w:r>
+          </w:p>
+        </w:tc>
+        <w:tc>
+          <w:tcPr>
+            <w:tcW w:type="dxa" w:w="2663"/>
+            <w:vAlign w:val="center"/>
+            <w:shd w:fill="D9EDF7"/>
+          </w:tcPr>
+          <w:p>
+            <w:pPr>
+              <w:spacing w:after="0"/>
+            </w:pPr>
+            <w:r/>
+            <w:r>
+              <w:rPr>
+                <w:b/>
+              </w:rPr>
+              <w:t>Stand-up question</w:t>
+            </w:r>
+          </w:p>
+        </w:tc>
+        <w:tc>
+          <w:tcPr>
+            <w:tcW w:type="dxa" w:w="2663"/>
+            <w:vAlign w:val="center"/>
+            <w:shd w:fill="D9EDF7"/>
+          </w:tcPr>
+          <w:p>
+            <w:pPr>
+              <w:spacing w:after="0"/>
+            </w:pPr>
+            <w:r/>
+            <w:r>
+              <w:rPr>
+                <w:b/>
+              </w:rPr>
+              <w:t>Response</w:t>
+            </w:r>
+          </w:p>
+        </w:tc>
+      </w:tr>
+      <w:tr>
+        <w:tc>
+          <w:tcPr>
+            <w:tcW w:type="dxa" w:w="2663"/>
+            <w:vAlign w:val="center"/>
+            <w:vMerge w:val="restart"/>
+            <w:shd w:fill="D9EDF7"/>
+            <w:textDirection w:val="btLr"/>
+          </w:tcPr>
+          <w:p>
+            <w:pPr>
+              <w:spacing w:after="0"/>
+              <w:jc w:val="center"/>
+            </w:pPr>
+            <w:r/>
+            <w:r>
+              <w:t>Tuesday</w:t>
+            </w:r>
+          </w:p>
+          <w:p>
+            <w:pPr>
+              <w:spacing w:after="0"/>
+            </w:pPr>
+            <w:r/>
+          </w:p>
+          <w:p>
+            <w:pPr>
+              <w:spacing w:after="0"/>
+            </w:pPr>
+            <w:r/>
+          </w:p>
+        </w:tc>
+        <w:tc>
+          <w:tcPr>
+            <w:tcW w:type="dxa" w:w="2663"/>
+            <w:vAlign w:val="center"/>
+            <w:shd w:fill="EAF4F9"/>
+          </w:tcPr>
+          <w:p>
+            <w:pPr>
+              <w:spacing w:after="0"/>
+            </w:pPr>
+            <w:r/>
+            <w:r>
+              <w:t>1</w:t>
+            </w:r>
+          </w:p>
+        </w:tc>
+        <w:tc>
+          <w:tcPr>
+            <w:tcW w:type="dxa" w:w="2663"/>
+            <w:vAlign w:val="center"/>
+            <w:shd w:fill="EAF4F9"/>
+          </w:tcPr>
+          <w:p>
+            <w:pPr>
+              <w:spacing w:after="0"/>
+            </w:pPr>
+            <w:r/>
+            <w:r>
+              <w:t>What did I complete since the last stand-up?</w:t>
+            </w:r>
+          </w:p>
+        </w:tc>
+        <w:tc>
+          <w:tcPr>
+            <w:tcW w:type="dxa" w:w="2663"/>
+            <w:vAlign w:val="center"/>
+          </w:tcPr>
+          <w:p>
+            <w:pPr>
+              <w:spacing w:after="0"/>
+            </w:pPr>
+            <w:r/>
+            <w:r>
+              <w:t>Reviewed the student problem, target market and value proposition.</w:t>
+            </w:r>
+          </w:p>
+        </w:tc>
+      </w:tr>
+      <w:tr>
+        <w:tc>
+          <w:tcPr>
+            <w:tcW w:type="dxa" w:w="2663"/>
+            <w:vAlign w:val="center"/>
+            <w:vMerge/>
+            <w:shd w:fill="D9EDF7"/>
+          </w:tcPr>
+          <w:p/>
+        </w:tc>
+        <w:tc>
+          <w:tcPr>
+            <w:tcW w:type="dxa" w:w="2663"/>
+            <w:vAlign w:val="center"/>
+            <w:shd w:fill="EAF4F9"/>
+          </w:tcPr>
+          <w:p>
+            <w:pPr>
+              <w:spacing w:after="0"/>
+            </w:pPr>
+            <w:r/>
+            <w:r>
+              <w:t>2</w:t>
+            </w:r>
+          </w:p>
+        </w:tc>
+        <w:tc>
+          <w:tcPr>
+            <w:tcW w:type="dxa" w:w="2663"/>
+            <w:vAlign w:val="center"/>
+            <w:shd w:fill="EAF4F9"/>
+          </w:tcPr>
+          <w:p>
+            <w:pPr>
+              <w:spacing w:after="0"/>
+            </w:pPr>
+            <w:r/>
+            <w:r>
+              <w:t>What am I planning to complete between now and the next stand-up?</w:t>
+            </w:r>
+          </w:p>
+        </w:tc>
+        <w:tc>
+          <w:tcPr>
+            <w:tcW w:type="dxa" w:w="2663"/>
+            <w:vAlign w:val="center"/>
+          </w:tcPr>
+          <w:p>
+            <w:pPr>
+              <w:spacing w:after="0"/>
+            </w:pPr>
+            <w:r/>
+            <w:r>
+              <w:t>Prepare the business idea and Microsoft Teams presentation.</w:t>
+            </w:r>
+          </w:p>
+        </w:tc>
+      </w:tr>
+      <w:tr>
+        <w:tc>
+          <w:tcPr>
+            <w:tcW w:type="dxa" w:w="2663"/>
+            <w:vAlign w:val="center"/>
+            <w:vMerge/>
+            <w:shd w:fill="D9EDF7"/>
+          </w:tcPr>
+          <w:p/>
+        </w:tc>
+        <w:tc>
+          <w:tcPr>
+            <w:tcW w:type="dxa" w:w="2663"/>
+            <w:vAlign w:val="center"/>
+            <w:shd w:fill="EAF4F9"/>
+          </w:tcPr>
+          <w:p>
+            <w:pPr>
+              <w:spacing w:after="0"/>
+            </w:pPr>
+            <w:r/>
+            <w:r>
+              <w:t>3</w:t>
+            </w:r>
+          </w:p>
+        </w:tc>
+        <w:tc>
+          <w:tcPr>
+            <w:tcW w:type="dxa" w:w="2663"/>
+            <w:vAlign w:val="center"/>
+            <w:shd w:fill="EAF4F9"/>
+          </w:tcPr>
+          <w:p>
+            <w:pPr>
+              <w:spacing w:after="0"/>
+            </w:pPr>
+            <w:r/>
+            <w:r>
+              <w:t>What are my impediments, risks or problems?</w:t>
+            </w:r>
+          </w:p>
+        </w:tc>
+        <w:tc>
+          <w:tcPr>
+            <w:tcW w:type="dxa" w:w="2663"/>
+            <w:vAlign w:val="center"/>
+          </w:tcPr>
+          <w:p>
+            <w:pPr>
+              <w:spacing w:after="0"/>
+            </w:pPr>
+            <w:r/>
+            <w:r>
+              <w:t>Supplier prices and delivery costs were not confirmed.</w:t>
+            </w:r>
+          </w:p>
+        </w:tc>
+      </w:tr>
+    </w:tbl>
     <w:p>
       <w:pPr>
-        <w:pStyle w:val="ListBullet"/>
+        <w:spacing w:after="0"/>
       </w:pPr>
-      <w:r>
-        <w:rPr>
-          <w:b/>
-        </w:rPr>
-        <w:t>Completed since the last stand-up:</w:t>
-      </w:r>
-      <w:r>
-        <w:t xml:space="preserve"> Reviewed the student problem, target market and value proposition.</w:t>
-      </w:r>
-    </w:p>
-    <w:p>
-      <w:pPr>
-        <w:pStyle w:val="ListBullet"/>
-      </w:pPr>
-      <w:r>
-        <w:rPr>
-          <w:b/>
-        </w:rPr>
-        <w:t>Planned before the next stand-up:</w:t>
-      </w:r>
-      <w:r>
-        <w:t xml:space="preserve"> Prepare the business idea and Microsoft Teams presentation.</w:t>
-      </w:r>
-    </w:p>
-    <w:p>
-      <w:pPr>
-        <w:pStyle w:val="ListBullet"/>
-      </w:pPr>
-      <w:r>
-        <w:rPr>
-          <w:b/>
-        </w:rPr>
-        <w:t>Impediments, risks or problems:</w:t>
-      </w:r>
-      <w:r>
-        <w:t xml:space="preserve"> Supplier prices and delivery costs were not confirmed.</w:t>
-      </w:r>
     </w:p>
     <w:p>
       <w:pPr>
         <w:pStyle w:val="Heading2"/>
+        <w:spacing w:before="200" w:after="80"/>
       </w:pPr>
       <w:r>
-        <w:t>Wednesday — 15 July 2026</w:t>
+        <w:t>Date: 15 July 2026</w:t>
       </w:r>
     </w:p>
+    <w:tbl>
+      <w:tblPr>
+        <w:tblStyle w:val="TableGrid"/>
+        <w:tblW w:type="auto" w:w="0"/>
+        <w:jc w:val="center"/>
+        <w:tblLayout w:type="autofit"/>
+        <w:tblLook w:firstColumn="1" w:firstRow="1" w:lastColumn="0" w:lastRow="0" w:noHBand="0" w:noVBand="1" w:val="04A0"/>
+      </w:tblPr>
+      <w:tblGrid>
+        <w:gridCol w:w="2663"/>
+        <w:gridCol w:w="2663"/>
+        <w:gridCol w:w="2663"/>
+        <w:gridCol w:w="2663"/>
+      </w:tblGrid>
+      <w:tr>
+        <w:tc>
+          <w:tcPr>
+            <w:tcW w:type="dxa" w:w="2663"/>
+            <w:vAlign w:val="center"/>
+            <w:shd w:fill="D9EDF7"/>
+          </w:tcPr>
+          <w:p>
+            <w:pPr>
+              <w:spacing w:after="0"/>
+            </w:pPr>
+            <w:r/>
+            <w:r>
+              <w:rPr>
+                <w:b/>
+              </w:rPr>
+              <w:t>Day</w:t>
+            </w:r>
+          </w:p>
+        </w:tc>
+        <w:tc>
+          <w:tcPr>
+            <w:tcW w:type="dxa" w:w="2663"/>
+            <w:vAlign w:val="center"/>
+            <w:shd w:fill="D9EDF7"/>
+          </w:tcPr>
+          <w:p>
+            <w:pPr>
+              <w:spacing w:after="0"/>
+            </w:pPr>
+            <w:r/>
+            <w:r>
+              <w:rPr>
+                <w:b/>
+              </w:rPr>
+              <w:t>No.</w:t>
+            </w:r>
+          </w:p>
+        </w:tc>
+        <w:tc>
+          <w:tcPr>
+            <w:tcW w:type="dxa" w:w="2663"/>
+            <w:vAlign w:val="center"/>
+            <w:shd w:fill="D9EDF7"/>
+          </w:tcPr>
+          <w:p>
+            <w:pPr>
+              <w:spacing w:after="0"/>
+            </w:pPr>
+            <w:r/>
+            <w:r>
+              <w:rPr>
+                <w:b/>
+              </w:rPr>
+              <w:t>Stand-up question</w:t>
+            </w:r>
+          </w:p>
+        </w:tc>
+        <w:tc>
+          <w:tcPr>
+            <w:tcW w:type="dxa" w:w="2663"/>
+            <w:vAlign w:val="center"/>
+            <w:shd w:fill="D9EDF7"/>
+          </w:tcPr>
+          <w:p>
+            <w:pPr>
+              <w:spacing w:after="0"/>
+            </w:pPr>
+            <w:r/>
+            <w:r>
+              <w:rPr>
+                <w:b/>
+              </w:rPr>
+              <w:t>Response</w:t>
+            </w:r>
+          </w:p>
+        </w:tc>
+      </w:tr>
+      <w:tr>
+        <w:tc>
+          <w:tcPr>
+            <w:tcW w:type="dxa" w:w="2663"/>
+            <w:vAlign w:val="center"/>
+            <w:vMerge w:val="restart"/>
+            <w:shd w:fill="D9EDF7"/>
+            <w:textDirection w:val="btLr"/>
+          </w:tcPr>
+          <w:p>
+            <w:pPr>
+              <w:spacing w:after="0"/>
+              <w:jc w:val="center"/>
+            </w:pPr>
+            <w:r/>
+            <w:r>
+              <w:t>Wednesday</w:t>
+            </w:r>
+          </w:p>
+          <w:p>
+            <w:pPr>
+              <w:spacing w:after="0"/>
+            </w:pPr>
+            <w:r/>
+          </w:p>
+          <w:p>
+            <w:pPr>
+              <w:spacing w:after="0"/>
+            </w:pPr>
+            <w:r/>
+          </w:p>
+        </w:tc>
+        <w:tc>
+          <w:tcPr>
+            <w:tcW w:type="dxa" w:w="2663"/>
+            <w:vAlign w:val="center"/>
+            <w:shd w:fill="EAF4F9"/>
+          </w:tcPr>
+          <w:p>
+            <w:pPr>
+              <w:spacing w:after="0"/>
+            </w:pPr>
+            <w:r/>
+            <w:r>
+              <w:t>1</w:t>
+            </w:r>
+          </w:p>
+        </w:tc>
+        <w:tc>
+          <w:tcPr>
+            <w:tcW w:type="dxa" w:w="2663"/>
+            <w:vAlign w:val="center"/>
+            <w:shd w:fill="EAF4F9"/>
+          </w:tcPr>
+          <w:p>
+            <w:pPr>
+              <w:spacing w:after="0"/>
+            </w:pPr>
+            <w:r/>
+            <w:r>
+              <w:t>What did I complete since the last stand-up?</w:t>
+            </w:r>
+          </w:p>
+        </w:tc>
+        <w:tc>
+          <w:tcPr>
+            <w:tcW w:type="dxa" w:w="2663"/>
+            <w:vAlign w:val="center"/>
+          </w:tcPr>
+          <w:p>
+            <w:pPr>
+              <w:spacing w:after="0"/>
+            </w:pPr>
+            <w:r/>
+            <w:r>
+              <w:t>Presented the D6 Food Bulk business idea as a team on Microsoft Teams.</w:t>
+            </w:r>
+          </w:p>
+        </w:tc>
+      </w:tr>
+      <w:tr>
+        <w:tc>
+          <w:tcPr>
+            <w:tcW w:type="dxa" w:w="2663"/>
+            <w:vAlign w:val="center"/>
+            <w:vMerge/>
+            <w:shd w:fill="D9EDF7"/>
+          </w:tcPr>
+          <w:p/>
+        </w:tc>
+        <w:tc>
+          <w:tcPr>
+            <w:tcW w:type="dxa" w:w="2663"/>
+            <w:vAlign w:val="center"/>
+            <w:shd w:fill="EAF4F9"/>
+          </w:tcPr>
+          <w:p>
+            <w:pPr>
+              <w:spacing w:after="0"/>
+            </w:pPr>
+            <w:r/>
+            <w:r>
+              <w:t>2</w:t>
+            </w:r>
+          </w:p>
+        </w:tc>
+        <w:tc>
+          <w:tcPr>
+            <w:tcW w:type="dxa" w:w="2663"/>
+            <w:vAlign w:val="center"/>
+            <w:shd w:fill="EAF4F9"/>
+          </w:tcPr>
+          <w:p>
+            <w:pPr>
+              <w:spacing w:after="0"/>
+            </w:pPr>
+            <w:r/>
+            <w:r>
+              <w:t>What am I planning to complete between now and the next stand-up?</w:t>
+            </w:r>
+          </w:p>
+        </w:tc>
+        <w:tc>
+          <w:tcPr>
+            <w:tcW w:type="dxa" w:w="2663"/>
+            <w:vAlign w:val="center"/>
+          </w:tcPr>
+          <w:p>
+            <w:pPr>
+              <w:spacing w:after="0"/>
+            </w:pPr>
+            <w:r/>
+            <w:r>
+              <w:t>Use the presentation discussion to improve the ordering and delivery process.</w:t>
+            </w:r>
+          </w:p>
+        </w:tc>
+      </w:tr>
+      <w:tr>
+        <w:tc>
+          <w:tcPr>
+            <w:tcW w:type="dxa" w:w="2663"/>
+            <w:vAlign w:val="center"/>
+            <w:vMerge/>
+            <w:shd w:fill="D9EDF7"/>
+          </w:tcPr>
+          <w:p/>
+        </w:tc>
+        <w:tc>
+          <w:tcPr>
+            <w:tcW w:type="dxa" w:w="2663"/>
+            <w:vAlign w:val="center"/>
+            <w:shd w:fill="EAF4F9"/>
+          </w:tcPr>
+          <w:p>
+            <w:pPr>
+              <w:spacing w:after="0"/>
+            </w:pPr>
+            <w:r/>
+            <w:r>
+              <w:t>3</w:t>
+            </w:r>
+          </w:p>
+        </w:tc>
+        <w:tc>
+          <w:tcPr>
+            <w:tcW w:type="dxa" w:w="2663"/>
+            <w:vAlign w:val="center"/>
+            <w:shd w:fill="EAF4F9"/>
+          </w:tcPr>
+          <w:p>
+            <w:pPr>
+              <w:spacing w:after="0"/>
+            </w:pPr>
+            <w:r/>
+            <w:r>
+              <w:t>What are my impediments, risks or problems?</w:t>
+            </w:r>
+          </w:p>
+        </w:tc>
+        <w:tc>
+          <w:tcPr>
+            <w:tcW w:type="dxa" w:w="2663"/>
+            <w:vAlign w:val="center"/>
+          </w:tcPr>
+          <w:p>
+            <w:pPr>
+              <w:spacing w:after="0"/>
+            </w:pPr>
+            <w:r/>
+            <w:r>
+              <w:t>No problems so far.</w:t>
+            </w:r>
+          </w:p>
+        </w:tc>
+      </w:tr>
+    </w:tbl>
     <w:p>
       <w:pPr>
-        <w:pStyle w:val="ListBullet"/>
+        <w:spacing w:after="0"/>
       </w:pPr>
-      <w:r>
-        <w:rPr>
-          <w:b/>
-        </w:rPr>
-        <w:t>Completed since the last stand-up:</w:t>
-      </w:r>
-      <w:r>
-        <w:t xml:space="preserve"> Presented the D6 Food Bulk business idea as a team on Microsoft Teams.</w:t>
-      </w:r>
-    </w:p>
-    <w:p>
-      <w:pPr>
-        <w:pStyle w:val="ListBullet"/>
-      </w:pPr>
-      <w:r>
-        <w:rPr>
-          <w:b/>
-        </w:rPr>
-        <w:t>Planned before the next stand-up:</w:t>
-      </w:r>
-      <w:r>
-        <w:t xml:space="preserve"> Use the presentation discussion to improve the ordering and delivery process.</w:t>
-      </w:r>
-    </w:p>
-    <w:p>
-      <w:pPr>
-        <w:pStyle w:val="ListBullet"/>
-      </w:pPr>
-      <w:r>
-        <w:rPr>
-          <w:b/>
-        </w:rPr>
-        <w:t>Impediments, risks or problems:</w:t>
-      </w:r>
-      <w:r>
-        <w:t xml:space="preserve"> No problems so far.</w:t>
-      </w:r>
     </w:p>
     <w:p>
       <w:pPr>
         <w:pStyle w:val="Heading2"/>
+        <w:spacing w:before="200" w:after="80"/>
       </w:pPr>
       <w:r>
-        <w:t>Thursday — 16 July 2026</w:t>
+        <w:t>Date: 16 July 2026</w:t>
       </w:r>
     </w:p>
+    <w:tbl>
+      <w:tblPr>
+        <w:tblStyle w:val="TableGrid"/>
+        <w:tblW w:type="auto" w:w="0"/>
+        <w:jc w:val="center"/>
+        <w:tblLayout w:type="autofit"/>
+        <w:tblLook w:firstColumn="1" w:firstRow="1" w:lastColumn="0" w:lastRow="0" w:noHBand="0" w:noVBand="1" w:val="04A0"/>
+      </w:tblPr>
+      <w:tblGrid>
+        <w:gridCol w:w="2663"/>
+        <w:gridCol w:w="2663"/>
+        <w:gridCol w:w="2663"/>
+        <w:gridCol w:w="2663"/>
+      </w:tblGrid>
+      <w:tr>
+        <w:tc>
+          <w:tcPr>
+            <w:tcW w:type="dxa" w:w="2663"/>
+            <w:vAlign w:val="center"/>
+            <w:shd w:fill="D9EDF7"/>
+          </w:tcPr>
+          <w:p>
+            <w:pPr>
+              <w:spacing w:after="0"/>
+            </w:pPr>
+            <w:r/>
+            <w:r>
+              <w:rPr>
+                <w:b/>
+              </w:rPr>
+              <w:t>Day</w:t>
+            </w:r>
+          </w:p>
+        </w:tc>
+        <w:tc>
+          <w:tcPr>
+            <w:tcW w:type="dxa" w:w="2663"/>
+            <w:vAlign w:val="center"/>
+            <w:shd w:fill="D9EDF7"/>
+          </w:tcPr>
+          <w:p>
+            <w:pPr>
+              <w:spacing w:after="0"/>
+            </w:pPr>
+            <w:r/>
+            <w:r>
+              <w:rPr>
+                <w:b/>
+              </w:rPr>
+              <w:t>No.</w:t>
+            </w:r>
+          </w:p>
+        </w:tc>
+        <w:tc>
+          <w:tcPr>
+            <w:tcW w:type="dxa" w:w="2663"/>
+            <w:vAlign w:val="center"/>
+            <w:shd w:fill="D9EDF7"/>
+          </w:tcPr>
+          <w:p>
+            <w:pPr>
+              <w:spacing w:after="0"/>
+            </w:pPr>
+            <w:r/>
+            <w:r>
+              <w:rPr>
+                <w:b/>
+              </w:rPr>
+              <w:t>Stand-up question</w:t>
+            </w:r>
+          </w:p>
+        </w:tc>
+        <w:tc>
+          <w:tcPr>
+            <w:tcW w:type="dxa" w:w="2663"/>
+            <w:vAlign w:val="center"/>
+            <w:shd w:fill="D9EDF7"/>
+          </w:tcPr>
+          <w:p>
+            <w:pPr>
+              <w:spacing w:after="0"/>
+            </w:pPr>
+            <w:r/>
+            <w:r>
+              <w:rPr>
+                <w:b/>
+              </w:rPr>
+              <w:t>Response</w:t>
+            </w:r>
+          </w:p>
+        </w:tc>
+      </w:tr>
+      <w:tr>
+        <w:tc>
+          <w:tcPr>
+            <w:tcW w:type="dxa" w:w="2663"/>
+            <w:vAlign w:val="center"/>
+            <w:vMerge w:val="restart"/>
+            <w:shd w:fill="D9EDF7"/>
+            <w:textDirection w:val="btLr"/>
+          </w:tcPr>
+          <w:p>
+            <w:pPr>
+              <w:spacing w:after="0"/>
+              <w:jc w:val="center"/>
+            </w:pPr>
+            <w:r/>
+            <w:r>
+              <w:t>Thursday</w:t>
+            </w:r>
+          </w:p>
+          <w:p>
+            <w:pPr>
+              <w:spacing w:after="0"/>
+            </w:pPr>
+            <w:r/>
+          </w:p>
+          <w:p>
+            <w:pPr>
+              <w:spacing w:after="0"/>
+            </w:pPr>
+            <w:r/>
+          </w:p>
+        </w:tc>
+        <w:tc>
+          <w:tcPr>
+            <w:tcW w:type="dxa" w:w="2663"/>
+            <w:vAlign w:val="center"/>
+            <w:shd w:fill="EAF4F9"/>
+          </w:tcPr>
+          <w:p>
+            <w:pPr>
+              <w:spacing w:after="0"/>
+            </w:pPr>
+            <w:r/>
+            <w:r>
+              <w:t>1</w:t>
+            </w:r>
+          </w:p>
+        </w:tc>
+        <w:tc>
+          <w:tcPr>
+            <w:tcW w:type="dxa" w:w="2663"/>
+            <w:vAlign w:val="center"/>
+            <w:shd w:fill="EAF4F9"/>
+          </w:tcPr>
+          <w:p>
+            <w:pPr>
+              <w:spacing w:after="0"/>
+            </w:pPr>
+            <w:r/>
+            <w:r>
+              <w:t>What did I complete since the last stand-up?</w:t>
+            </w:r>
+          </w:p>
+        </w:tc>
+        <w:tc>
+          <w:tcPr>
+            <w:tcW w:type="dxa" w:w="2663"/>
+            <w:vAlign w:val="center"/>
+          </w:tcPr>
+          <w:p>
+            <w:pPr>
+              <w:spacing w:after="0"/>
+            </w:pPr>
+            <w:r/>
+            <w:r>
+              <w:t>Mapped Place and Pay, Pool and Fulfil, and Deliver and Collect.</w:t>
+            </w:r>
+          </w:p>
+        </w:tc>
+      </w:tr>
+      <w:tr>
+        <w:tc>
+          <w:tcPr>
+            <w:tcW w:type="dxa" w:w="2663"/>
+            <w:vAlign w:val="center"/>
+            <w:vMerge/>
+            <w:shd w:fill="D9EDF7"/>
+          </w:tcPr>
+          <w:p/>
+        </w:tc>
+        <w:tc>
+          <w:tcPr>
+            <w:tcW w:type="dxa" w:w="2663"/>
+            <w:vAlign w:val="center"/>
+            <w:shd w:fill="EAF4F9"/>
+          </w:tcPr>
+          <w:p>
+            <w:pPr>
+              <w:spacing w:after="0"/>
+            </w:pPr>
+            <w:r/>
+            <w:r>
+              <w:t>2</w:t>
+            </w:r>
+          </w:p>
+        </w:tc>
+        <w:tc>
+          <w:tcPr>
+            <w:tcW w:type="dxa" w:w="2663"/>
+            <w:vAlign w:val="center"/>
+            <w:shd w:fill="EAF4F9"/>
+          </w:tcPr>
+          <w:p>
+            <w:pPr>
+              <w:spacing w:after="0"/>
+            </w:pPr>
+            <w:r/>
+            <w:r>
+              <w:t>What am I planning to complete between now and the next stand-up?</w:t>
+            </w:r>
+          </w:p>
+        </w:tc>
+        <w:tc>
+          <w:tcPr>
+            <w:tcW w:type="dxa" w:w="2663"/>
+            <w:vAlign w:val="center"/>
+          </w:tcPr>
+          <w:p>
+            <w:pPr>
+              <w:spacing w:after="0"/>
+            </w:pPr>
+            <w:r/>
+            <w:r>
+              <w:t>Review the slides and improve the Block Agent section.</w:t>
+            </w:r>
+          </w:p>
+        </w:tc>
+      </w:tr>
+      <w:tr>
+        <w:tc>
+          <w:tcPr>
+            <w:tcW w:type="dxa" w:w="2663"/>
+            <w:vAlign w:val="center"/>
+            <w:vMerge/>
+            <w:shd w:fill="D9EDF7"/>
+          </w:tcPr>
+          <w:p/>
+        </w:tc>
+        <w:tc>
+          <w:tcPr>
+            <w:tcW w:type="dxa" w:w="2663"/>
+            <w:vAlign w:val="center"/>
+            <w:shd w:fill="EAF4F9"/>
+          </w:tcPr>
+          <w:p>
+            <w:pPr>
+              <w:spacing w:after="0"/>
+            </w:pPr>
+            <w:r/>
+            <w:r>
+              <w:t>3</w:t>
+            </w:r>
+          </w:p>
+        </w:tc>
+        <w:tc>
+          <w:tcPr>
+            <w:tcW w:type="dxa" w:w="2663"/>
+            <w:vAlign w:val="center"/>
+            <w:shd w:fill="EAF4F9"/>
+          </w:tcPr>
+          <w:p>
+            <w:pPr>
+              <w:spacing w:after="0"/>
+            </w:pPr>
+            <w:r/>
+            <w:r>
+              <w:t>What are my impediments, risks or problems?</w:t>
+            </w:r>
+          </w:p>
+        </w:tc>
+        <w:tc>
+          <w:tcPr>
+            <w:tcW w:type="dxa" w:w="2663"/>
+            <w:vAlign w:val="center"/>
+          </w:tcPr>
+          <w:p>
+            <w:pPr>
+              <w:spacing w:after="0"/>
+            </w:pPr>
+            <w:r/>
+            <w:r>
+              <w:t>No risks.</w:t>
+            </w:r>
+          </w:p>
+        </w:tc>
+      </w:tr>
+    </w:tbl>
     <w:p>
       <w:pPr>
-        <w:pStyle w:val="ListBullet"/>
+        <w:spacing w:after="0"/>
       </w:pPr>
-      <w:r>
-        <w:rPr>
-          <w:b/>
-        </w:rPr>
-        <w:t>Completed since the last stand-up:</w:t>
-      </w:r>
-      <w:r>
-        <w:t xml:space="preserve"> Mapped Place and Pay, Pool and Fulfil, and Deliver and Collect.</w:t>
-      </w:r>
-    </w:p>
-    <w:p>
-      <w:pPr>
-        <w:pStyle w:val="ListBullet"/>
-      </w:pPr>
-      <w:r>
-        <w:rPr>
-          <w:b/>
-        </w:rPr>
-        <w:t>Planned before the next stand-up:</w:t>
-      </w:r>
-      <w:r>
-        <w:t xml:space="preserve"> Review the slides and improve the Block Agent section.</w:t>
-      </w:r>
-    </w:p>
-    <w:p>
-      <w:pPr>
-        <w:pStyle w:val="ListBullet"/>
-      </w:pPr>
-      <w:r>
-        <w:rPr>
-          <w:b/>
-        </w:rPr>
-        <w:t>Impediments, risks or problems:</w:t>
-      </w:r>
-      <w:r>
-        <w:t xml:space="preserve"> No risks.</w:t>
-      </w:r>
     </w:p>
     <w:p>
       <w:pPr>
         <w:pStyle w:val="Heading2"/>
+        <w:spacing w:before="200" w:after="80"/>
       </w:pPr>
       <w:r>
-        <w:t>Friday — 17 July 2026</w:t>
+        <w:t>Date: 17 July 2026</w:t>
       </w:r>
     </w:p>
+    <w:tbl>
+      <w:tblPr>
+        <w:tblStyle w:val="TableGrid"/>
+        <w:tblW w:type="auto" w:w="0"/>
+        <w:jc w:val="center"/>
+        <w:tblLayout w:type="autofit"/>
+        <w:tblLook w:firstColumn="1" w:firstRow="1" w:lastColumn="0" w:lastRow="0" w:noHBand="0" w:noVBand="1" w:val="04A0"/>
+      </w:tblPr>
+      <w:tblGrid>
+        <w:gridCol w:w="2663"/>
+        <w:gridCol w:w="2663"/>
+        <w:gridCol w:w="2663"/>
+        <w:gridCol w:w="2663"/>
+      </w:tblGrid>
+      <w:tr>
+        <w:tc>
+          <w:tcPr>
+            <w:tcW w:type="dxa" w:w="2663"/>
+            <w:vAlign w:val="center"/>
+            <w:shd w:fill="D9EDF7"/>
+          </w:tcPr>
+          <w:p>
+            <w:pPr>
+              <w:spacing w:after="0"/>
+            </w:pPr>
+            <w:r/>
+            <w:r>
+              <w:rPr>
+                <w:b/>
+              </w:rPr>
+              <w:t>Day</w:t>
+            </w:r>
+          </w:p>
+        </w:tc>
+        <w:tc>
+          <w:tcPr>
+            <w:tcW w:type="dxa" w:w="2663"/>
+            <w:vAlign w:val="center"/>
+            <w:shd w:fill="D9EDF7"/>
+          </w:tcPr>
+          <w:p>
+            <w:pPr>
+              <w:spacing w:after="0"/>
+            </w:pPr>
+            <w:r/>
+            <w:r>
+              <w:rPr>
+                <w:b/>
+              </w:rPr>
+              <w:t>No.</w:t>
+            </w:r>
+          </w:p>
+        </w:tc>
+        <w:tc>
+          <w:tcPr>
+            <w:tcW w:type="dxa" w:w="2663"/>
+            <w:vAlign w:val="center"/>
+            <w:shd w:fill="D9EDF7"/>
+          </w:tcPr>
+          <w:p>
+            <w:pPr>
+              <w:spacing w:after="0"/>
+            </w:pPr>
+            <w:r/>
+            <w:r>
+              <w:rPr>
+                <w:b/>
+              </w:rPr>
+              <w:t>Stand-up question</w:t>
+            </w:r>
+          </w:p>
+        </w:tc>
+        <w:tc>
+          <w:tcPr>
+            <w:tcW w:type="dxa" w:w="2663"/>
+            <w:vAlign w:val="center"/>
+            <w:shd w:fill="D9EDF7"/>
+          </w:tcPr>
+          <w:p>
+            <w:pPr>
+              <w:spacing w:after="0"/>
+            </w:pPr>
+            <w:r/>
+            <w:r>
+              <w:rPr>
+                <w:b/>
+              </w:rPr>
+              <w:t>Response</w:t>
+            </w:r>
+          </w:p>
+        </w:tc>
+      </w:tr>
+      <w:tr>
+        <w:tc>
+          <w:tcPr>
+            <w:tcW w:type="dxa" w:w="2663"/>
+            <w:vAlign w:val="center"/>
+            <w:vMerge w:val="restart"/>
+            <w:shd w:fill="D9EDF7"/>
+            <w:textDirection w:val="btLr"/>
+          </w:tcPr>
+          <w:p>
+            <w:pPr>
+              <w:spacing w:after="0"/>
+              <w:jc w:val="center"/>
+            </w:pPr>
+            <w:r/>
+            <w:r>
+              <w:t>Friday</w:t>
+            </w:r>
+          </w:p>
+          <w:p>
+            <w:pPr>
+              <w:spacing w:after="0"/>
+            </w:pPr>
+            <w:r/>
+          </w:p>
+          <w:p>
+            <w:pPr>
+              <w:spacing w:after="0"/>
+            </w:pPr>
+            <w:r/>
+          </w:p>
+        </w:tc>
+        <w:tc>
+          <w:tcPr>
+            <w:tcW w:type="dxa" w:w="2663"/>
+            <w:vAlign w:val="center"/>
+            <w:shd w:fill="EAF4F9"/>
+          </w:tcPr>
+          <w:p>
+            <w:pPr>
+              <w:spacing w:after="0"/>
+            </w:pPr>
+            <w:r/>
+            <w:r>
+              <w:t>1</w:t>
+            </w:r>
+          </w:p>
+        </w:tc>
+        <w:tc>
+          <w:tcPr>
+            <w:tcW w:type="dxa" w:w="2663"/>
+            <w:vAlign w:val="center"/>
+            <w:shd w:fill="EAF4F9"/>
+          </w:tcPr>
+          <w:p>
+            <w:pPr>
+              <w:spacing w:after="0"/>
+            </w:pPr>
+            <w:r/>
+            <w:r>
+              <w:t>What did I complete since the last stand-up?</w:t>
+            </w:r>
+          </w:p>
+        </w:tc>
+        <w:tc>
+          <w:tcPr>
+            <w:tcW w:type="dxa" w:w="2663"/>
+            <w:vAlign w:val="center"/>
+          </w:tcPr>
+          <w:p>
+            <w:pPr>
+              <w:spacing w:after="0"/>
+            </w:pPr>
+            <w:r/>
+            <w:r>
+              <w:t>Not applicable.</w:t>
+            </w:r>
+          </w:p>
+        </w:tc>
+      </w:tr>
+      <w:tr>
+        <w:tc>
+          <w:tcPr>
+            <w:tcW w:type="dxa" w:w="2663"/>
+            <w:vAlign w:val="center"/>
+            <w:vMerge/>
+            <w:shd w:fill="D9EDF7"/>
+          </w:tcPr>
+          <w:p/>
+        </w:tc>
+        <w:tc>
+          <w:tcPr>
+            <w:tcW w:type="dxa" w:w="2663"/>
+            <w:vAlign w:val="center"/>
+            <w:shd w:fill="EAF4F9"/>
+          </w:tcPr>
+          <w:p>
+            <w:pPr>
+              <w:spacing w:after="0"/>
+            </w:pPr>
+            <w:r/>
+            <w:r>
+              <w:t>2</w:t>
+            </w:r>
+          </w:p>
+        </w:tc>
+        <w:tc>
+          <w:tcPr>
+            <w:tcW w:type="dxa" w:w="2663"/>
+            <w:vAlign w:val="center"/>
+            <w:shd w:fill="EAF4F9"/>
+          </w:tcPr>
+          <w:p>
+            <w:pPr>
+              <w:spacing w:after="0"/>
+            </w:pPr>
+            <w:r/>
+            <w:r>
+              <w:t>What am I planning to complete between now and the next stand-up?</w:t>
+            </w:r>
+          </w:p>
+        </w:tc>
+        <w:tc>
+          <w:tcPr>
+            <w:tcW w:type="dxa" w:w="2663"/>
+            <w:vAlign w:val="center"/>
+          </w:tcPr>
+          <w:p>
+            <w:pPr>
+              <w:spacing w:after="0"/>
+            </w:pPr>
+            <w:r/>
+            <w:r>
+              <w:t>Not applicable.</w:t>
+            </w:r>
+          </w:p>
+        </w:tc>
+      </w:tr>
+      <w:tr>
+        <w:tc>
+          <w:tcPr>
+            <w:tcW w:type="dxa" w:w="2663"/>
+            <w:vAlign w:val="center"/>
+            <w:vMerge/>
+            <w:shd w:fill="D9EDF7"/>
+          </w:tcPr>
+          <w:p/>
+        </w:tc>
+        <w:tc>
+          <w:tcPr>
+            <w:tcW w:type="dxa" w:w="2663"/>
+            <w:vAlign w:val="center"/>
+            <w:shd w:fill="EAF4F9"/>
+          </w:tcPr>
+          <w:p>
+            <w:pPr>
+              <w:spacing w:after="0"/>
+            </w:pPr>
+            <w:r/>
+            <w:r>
+              <w:t>3</w:t>
+            </w:r>
+          </w:p>
+        </w:tc>
+        <w:tc>
+          <w:tcPr>
+            <w:tcW w:type="dxa" w:w="2663"/>
+            <w:vAlign w:val="center"/>
+            <w:shd w:fill="EAF4F9"/>
+          </w:tcPr>
+          <w:p>
+            <w:pPr>
+              <w:spacing w:after="0"/>
+            </w:pPr>
+            <w:r/>
+            <w:r>
+              <w:t>What are my impediments, risks or problems?</w:t>
+            </w:r>
+          </w:p>
+        </w:tc>
+        <w:tc>
+          <w:tcPr>
+            <w:tcW w:type="dxa" w:w="2663"/>
+            <w:vAlign w:val="center"/>
+          </w:tcPr>
+          <w:p>
+            <w:pPr>
+              <w:spacing w:after="0"/>
+            </w:pPr>
+            <w:r/>
+            <w:r>
+              <w:t>Not applicable.</w:t>
+            </w:r>
+          </w:p>
+        </w:tc>
+      </w:tr>
+    </w:tbl>
     <w:p>
       <w:pPr>
-        <w:pStyle w:val="ListBullet"/>
+        <w:spacing w:after="0"/>
       </w:pPr>
-      <w:r>
-        <w:rPr>
-          <w:b/>
-        </w:rPr>
-        <w:t>Completed since the last stand-up:</w:t>
-      </w:r>
-      <w:r>
-        <w:t xml:space="preserve"> Not applicable.</w:t>
-      </w:r>
-    </w:p>
-    <w:p>
-      <w:pPr>
-        <w:pStyle w:val="ListBullet"/>
-      </w:pPr>
-      <w:r>
-        <w:rPr>
-          <w:b/>
-        </w:rPr>
-        <w:t>Planned before the next stand-up:</w:t>
-      </w:r>
-      <w:r>
-        <w:t xml:space="preserve"> Not applicable.</w:t>
-      </w:r>
-    </w:p>
-    <w:p>
-      <w:pPr>
-        <w:pStyle w:val="ListBullet"/>
-      </w:pPr>
-      <w:r>
-        <w:rPr>
-          <w:b/>
-        </w:rPr>
-        <w:t>Impediments, risks or problems:</w:t>
-      </w:r>
-      <w:r>
-        <w:t xml:space="preserve"> Not applicable.</w:t>
-      </w:r>
     </w:p>
     <w:p>
       <w:pPr>
@@ -600,7 +2209,7 @@
     </w:p>
     <w:p>
       <w:r>
-        <w:t>One of the main challenges was limiting the scope of the project. The team generated several ideas, but not all of them could be researched or developed during one sprint. Another challenge was making decisions without confirmed supplier and transport information. The team had to distinguish between confirmed project decisions and assumptions that still required validation. Coordinating tasks and ensuring that every activity appeared on the taskboard was also an area that required improvement.</w:t>
+        <w:t>One of the main challenges was limiting the project scope. The team generated several ideas, but not all of them could be researched or developed during one sprint. Another challenge was making decisions without confirmed supplier and transport information. The team had to distinguish between confirmed decisions and assumptions that still required validation. Coordinating tasks and ensuring that every activity appeared on the taskboard also required improvement.</w:t>
       </w:r>
     </w:p>
     <w:p>
@@ -672,7 +2281,7 @@
         <w:pStyle w:val="ListBullet"/>
       </w:pPr>
       <w:r>
-        <w:t>Avoid adding new features before completing the agreed sprint tasks.</w:t>
+        <w:t>Avoid adding new features before completing agreed sprint tasks.</w:t>
       </w:r>
     </w:p>
     <w:p>
@@ -685,7 +2294,7 @@
     </w:p>
     <w:p>
       <w:r>
-        <w:t>I learnt that Agile working is not only about completing tasks quickly. It also requires visibility, regular communication, prioritisation and continuous improvement. The taskboard helped the team understand what was planned, what was being worked on and what had been completed. The stand-up questions made it easier to identify blockers before they caused major delays.</w:t>
+        <w:t>I learnt that Agile working is not only about completing tasks quickly. It also requires visibility, regular communication, prioritisation and continuous improvement. The taskboard helped the team understand what was planned, what was in progress and what had been completed. The stand-up questions helped us identify blockers before they caused major delays.</w:t>
       </w:r>
     </w:p>
     <w:p>
@@ -697,7 +2306,7 @@
       <w:headerReference w:type="default" r:id="rId9"/>
       <w:footerReference w:type="default" r:id="rId10"/>
       <w:pgSz w:w="12240" w:h="15840"/>
-      <w:pgMar w:top="1020" w:right="1134" w:bottom="1020" w:left="1134" w:header="720" w:footer="720" w:gutter="0"/>
+      <w:pgMar w:top="850" w:right="794" w:bottom="850" w:left="794" w:header="720" w:footer="720" w:gutter="0"/>
       <w:cols w:space="720"/>
       <w:docGrid w:linePitch="360"/>
     </w:sectPr>
@@ -730,6 +2339,7 @@
     </w:pPr>
     <w:r>
       <w:rPr>
+        <w:rFonts w:ascii="Arial" w:hAnsi="Arial"/>
         <w:color w:val="6B7280"/>
         <w:sz w:val="16"/>
       </w:rPr>
@@ -1103,11 +2713,11 @@
     <w:qFormat/>
     <w:rsid w:val="00FC693F"/>
     <w:pPr>
-      <w:spacing w:after="120"/>
+      <w:spacing w:after="100"/>
     </w:pPr>
     <w:rPr>
-      <w:rFonts w:ascii="Aptos" w:hAnsi="Aptos"/>
-      <w:sz w:val="21"/>
+      <w:rFonts w:ascii="Arial" w:hAnsi="Arial"/>
+      <w:sz w:val="18"/>
     </w:rPr>
   </w:style>
   <w:style w:type="paragraph" w:styleId="Header">
@@ -1169,7 +2779,7 @@
       <w:outlineLvl w:val="0"/>
     </w:pPr>
     <w:rPr>
-      <w:rFonts w:asciiTheme="majorHAnsi" w:eastAsiaTheme="majorEastAsia" w:hAnsiTheme="majorHAnsi" w:cstheme="majorBidi" w:ascii="Aptos Display" w:hAnsi="Aptos Display"/>
+      <w:rFonts w:asciiTheme="majorHAnsi" w:eastAsiaTheme="majorEastAsia" w:hAnsiTheme="majorHAnsi" w:cstheme="majorBidi" w:ascii="Arial" w:hAnsi="Arial"/>
       <w:b/>
       <w:bCs/>
       <w:color w:val="1F2937"/>
@@ -1193,7 +2803,7 @@
       <w:outlineLvl w:val="1"/>
     </w:pPr>
     <w:rPr>
-      <w:rFonts w:asciiTheme="majorHAnsi" w:eastAsiaTheme="majorEastAsia" w:hAnsiTheme="majorHAnsi" w:cstheme="majorBidi" w:ascii="Aptos Display" w:hAnsi="Aptos Display"/>
+      <w:rFonts w:asciiTheme="majorHAnsi" w:eastAsiaTheme="majorEastAsia" w:hAnsiTheme="majorHAnsi" w:cstheme="majorBidi" w:ascii="Arial" w:hAnsi="Arial"/>
       <w:b/>
       <w:bCs/>
       <w:color w:val="1F2937"/>
@@ -1458,7 +3068,7 @@
       <w:contextualSpacing/>
     </w:pPr>
     <w:rPr>
-      <w:rFonts w:asciiTheme="majorHAnsi" w:eastAsiaTheme="majorEastAsia" w:hAnsiTheme="majorHAnsi" w:cstheme="majorBidi" w:ascii="Aptos Display" w:hAnsi="Aptos Display"/>
+      <w:rFonts w:asciiTheme="majorHAnsi" w:eastAsiaTheme="majorEastAsia" w:hAnsiTheme="majorHAnsi" w:cstheme="majorBidi" w:ascii="Arial" w:hAnsi="Arial"/>
       <w:color w:val="1F2937"/>
       <w:spacing w:val="5"/>
       <w:kern w:val="28"/>

</xml_diff>